<commit_message>
Actualización de documentación semana 4
</commit_message>
<xml_diff>
--- a/Documentación/Documentación semana 4.docx
+++ b/Documentación/Documentación semana 4.docx
@@ -821,7 +821,94 @@
           <w:sz w:val="24"/>
           <w:lang w:val="es-CO"/>
         </w:rPr>
-        <w:t xml:space="preserve">. Tomamos como ejemplo la clase </w:t>
+        <w:t xml:space="preserve">. </w:t>
+      </w:r>
+    </w:p>
+    <w:p>
+      <w:pPr>
+        <w:jc w:val="both"/>
+        <w:rPr>
+          <w:rFonts w:ascii="Arial" w:hAnsi="Arial" w:cs="Arial"/>
+          <w:sz w:val="24"/>
+          <w:lang w:val="es-CO"/>
+        </w:rPr>
+      </w:pPr>
+      <w:r>
+        <w:rPr>
+          <w:rFonts w:ascii="Arial" w:hAnsi="Arial" w:cs="Arial"/>
+          <w:noProof/>
+          <w:sz w:val="24"/>
+          <w:lang w:eastAsia="es-ES"/>
+        </w:rPr>
+        <w:drawing>
+          <wp:inline distT="0" distB="0" distL="0" distR="0">
+            <wp:extent cx="5400040" cy="3533140"/>
+            <wp:effectExtent l="0" t="0" r="0" b="0"/>
+            <wp:docPr id="13" name="Picture 13"/>
+            <wp:cNvGraphicFramePr>
+              <a:graphicFrameLocks xmlns:a="http://schemas.openxmlformats.org/drawingml/2006/main" noChangeAspect="1"/>
+            </wp:cNvGraphicFramePr>
+            <a:graphic xmlns:a="http://schemas.openxmlformats.org/drawingml/2006/main">
+              <a:graphicData uri="http://schemas.openxmlformats.org/drawingml/2006/picture">
+                <pic:pic xmlns:pic="http://schemas.openxmlformats.org/drawingml/2006/picture">
+                  <pic:nvPicPr>
+                    <pic:cNvPr id="13" name="Clase UML.png"/>
+                    <pic:cNvPicPr/>
+                  </pic:nvPicPr>
+                  <pic:blipFill>
+                    <a:blip r:embed="rId5">
+                      <a:extLst>
+                        <a:ext uri="{28A0092B-C50C-407E-A947-70E740481C1C}">
+                          <a14:useLocalDpi xmlns:a14="http://schemas.microsoft.com/office/drawing/2010/main" val="0"/>
+                        </a:ext>
+                      </a:extLst>
+                    </a:blip>
+                    <a:stretch>
+                      <a:fillRect/>
+                    </a:stretch>
+                  </pic:blipFill>
+                  <pic:spPr>
+                    <a:xfrm>
+                      <a:off x="0" y="0"/>
+                      <a:ext cx="5400040" cy="3533140"/>
+                    </a:xfrm>
+                    <a:prstGeom prst="rect">
+                      <a:avLst/>
+                    </a:prstGeom>
+                  </pic:spPr>
+                </pic:pic>
+              </a:graphicData>
+            </a:graphic>
+          </wp:inline>
+        </w:drawing>
+      </w:r>
+    </w:p>
+    <w:p>
+      <w:pPr>
+        <w:jc w:val="both"/>
+        <w:rPr>
+          <w:rFonts w:ascii="Arial" w:hAnsi="Arial" w:cs="Arial"/>
+          <w:sz w:val="24"/>
+          <w:lang w:val="es-CO"/>
+        </w:rPr>
+      </w:pPr>
+    </w:p>
+    <w:p>
+      <w:pPr>
+        <w:jc w:val="both"/>
+        <w:rPr>
+          <w:rFonts w:ascii="Arial" w:hAnsi="Arial" w:cs="Arial"/>
+          <w:sz w:val="24"/>
+          <w:lang w:val="es-CO"/>
+        </w:rPr>
+      </w:pPr>
+      <w:r>
+        <w:rPr>
+          <w:rFonts w:ascii="Arial" w:hAnsi="Arial" w:cs="Arial"/>
+          <w:sz w:val="24"/>
+          <w:lang w:val="es-CO"/>
+        </w:rPr>
+        <w:t xml:space="preserve">Tomamos como ejemplo la clase </w:t>
       </w:r>
       <w:proofErr w:type="spellStart"/>
       <w:r>
@@ -875,7 +962,7 @@
                     </pic:cNvPicPr>
                   </pic:nvPicPr>
                   <pic:blipFill rotWithShape="1">
-                    <a:blip r:embed="rId5">
+                    <a:blip r:embed="rId6">
                       <a:extLst>
                         <a:ext uri="{28A0092B-C50C-407E-A947-70E740481C1C}">
                           <a14:useLocalDpi xmlns:a14="http://schemas.microsoft.com/office/drawing/2010/main" val="0"/>
@@ -951,7 +1038,16 @@
           <w:sz w:val="24"/>
           <w:lang w:val="es-CO"/>
         </w:rPr>
-        <w:t>ositorio. A continuación, se an</w:t>
+        <w:t xml:space="preserve">ositorio. A continuación, </w:t>
+      </w:r>
+      <w:r>
+        <w:rPr>
+          <w:rFonts w:ascii="Arial" w:hAnsi="Arial" w:cs="Arial"/>
+          <w:sz w:val="24"/>
+          <w:lang w:val="es-CO"/>
+        </w:rPr>
+        <w:lastRenderedPageBreak/>
+        <w:t>se an</w:t>
       </w:r>
       <w:r>
         <w:rPr>
@@ -1126,25 +1222,43 @@
     </w:p>
     <w:p>
       <w:pPr>
-        <w:jc w:val="center"/>
-        <w:rPr>
-          <w:rFonts w:ascii="Arial" w:hAnsi="Arial" w:cs="Arial"/>
-          <w:sz w:val="24"/>
-          <w:lang w:val="es-CO"/>
-        </w:rPr>
-      </w:pPr>
-      <w:r>
-        <w:rPr>
-          <w:rFonts w:ascii="Arial" w:hAnsi="Arial" w:cs="Arial"/>
-          <w:sz w:val="24"/>
-          <w:lang w:val="es-CO"/>
-        </w:rPr>
-        <w:lastRenderedPageBreak/>
+        <w:jc w:val="both"/>
+        <w:rPr>
+          <w:rFonts w:ascii="Arial" w:hAnsi="Arial" w:cs="Arial"/>
+          <w:sz w:val="24"/>
+          <w:lang w:val="es-CO"/>
+        </w:rPr>
+      </w:pPr>
+      <w:r>
+        <w:rPr>
+          <w:rFonts w:ascii="Arial" w:hAnsi="Arial" w:cs="Arial"/>
+          <w:sz w:val="24"/>
+          <w:lang w:val="es-CO"/>
+        </w:rPr>
+        <w:t>A continuación, se muestra el diagrama UML de la implementación de este patrón usando como ejemplo la clase instructor:</w:t>
+      </w:r>
+    </w:p>
+    <w:p>
+      <w:pPr>
+        <w:jc w:val="both"/>
+        <w:rPr>
+          <w:rFonts w:ascii="Arial" w:hAnsi="Arial" w:cs="Arial"/>
+          <w:sz w:val="24"/>
+          <w:lang w:val="es-CO"/>
+        </w:rPr>
+      </w:pPr>
+      <w:r>
+        <w:rPr>
+          <w:rFonts w:ascii="Arial" w:hAnsi="Arial" w:cs="Arial"/>
+          <w:noProof/>
+          <w:sz w:val="24"/>
+          <w:lang w:eastAsia="es-ES"/>
+        </w:rPr>
         <w:drawing>
-          <wp:inline distT="0" distB="0" distL="0" distR="0" wp14:anchorId="29CA6BCB" wp14:editId="67510E11">
-            <wp:extent cx="3263580" cy="1685925"/>
+          <wp:inline distT="0" distB="0" distL="0" distR="0">
+            <wp:extent cx="5400040" cy="3295650"/>
             <wp:effectExtent l="0" t="0" r="0" b="0"/>
-            <wp:docPr id="2" name="Picture 2"/>
+            <wp:docPr id="14" name="Picture 14"/>
             <wp:cNvGraphicFramePr>
               <a:graphicFrameLocks xmlns:a="http://schemas.openxmlformats.org/drawingml/2006/main" noChangeAspect="1"/>
             </wp:cNvGraphicFramePr>
@@ -1152,11 +1266,17 @@
               <a:graphicData uri="http://schemas.openxmlformats.org/drawingml/2006/picture">
                 <pic:pic xmlns:pic="http://schemas.openxmlformats.org/drawingml/2006/picture">
                   <pic:nvPicPr>
-                    <pic:cNvPr id="1" name=""/>
+                    <pic:cNvPr id="14" name="Copia de Clase UML.png"/>
                     <pic:cNvPicPr/>
                   </pic:nvPicPr>
                   <pic:blipFill>
-                    <a:blip r:embed="rId6"/>
+                    <a:blip r:embed="rId7">
+                      <a:extLst>
+                        <a:ext uri="{28A0092B-C50C-407E-A947-70E740481C1C}">
+                          <a14:useLocalDpi xmlns:a14="http://schemas.microsoft.com/office/drawing/2010/main" val="0"/>
+                        </a:ext>
+                      </a:extLst>
+                    </a:blip>
                     <a:stretch>
                       <a:fillRect/>
                     </a:stretch>
@@ -1164,7 +1284,7 @@
                   <pic:spPr>
                     <a:xfrm>
                       <a:off x="0" y="0"/>
-                      <a:ext cx="3274308" cy="1691467"/>
+                      <a:ext cx="5400040" cy="3295650"/>
                     </a:xfrm>
                     <a:prstGeom prst="rect">
                       <a:avLst/>
@@ -1179,6 +1299,75 @@
     </w:p>
     <w:p>
       <w:pPr>
+        <w:jc w:val="both"/>
+        <w:rPr>
+          <w:rFonts w:ascii="Arial" w:hAnsi="Arial" w:cs="Arial"/>
+          <w:sz w:val="24"/>
+          <w:lang w:val="es-CO"/>
+        </w:rPr>
+      </w:pPr>
+    </w:p>
+    <w:p>
+      <w:pPr>
+        <w:jc w:val="both"/>
+        <w:rPr>
+          <w:rFonts w:ascii="Arial" w:hAnsi="Arial" w:cs="Arial"/>
+          <w:sz w:val="24"/>
+          <w:lang w:val="es-CO"/>
+        </w:rPr>
+      </w:pPr>
+    </w:p>
+    <w:p>
+      <w:pPr>
+        <w:jc w:val="both"/>
+        <w:rPr>
+          <w:rFonts w:ascii="Arial" w:hAnsi="Arial" w:cs="Arial"/>
+          <w:sz w:val="24"/>
+          <w:lang w:val="es-CO"/>
+        </w:rPr>
+      </w:pPr>
+    </w:p>
+    <w:p>
+      <w:pPr>
+        <w:jc w:val="both"/>
+        <w:rPr>
+          <w:rFonts w:ascii="Arial" w:hAnsi="Arial" w:cs="Arial"/>
+          <w:sz w:val="24"/>
+          <w:lang w:val="es-CO"/>
+        </w:rPr>
+      </w:pPr>
+    </w:p>
+    <w:p>
+      <w:pPr>
+        <w:jc w:val="both"/>
+        <w:rPr>
+          <w:rFonts w:ascii="Arial" w:hAnsi="Arial" w:cs="Arial"/>
+          <w:sz w:val="24"/>
+          <w:lang w:val="es-CO"/>
+        </w:rPr>
+      </w:pPr>
+    </w:p>
+    <w:p>
+      <w:pPr>
+        <w:rPr>
+          <w:rFonts w:ascii="Arial" w:hAnsi="Arial" w:cs="Arial"/>
+          <w:sz w:val="24"/>
+          <w:lang w:val="es-CO"/>
+        </w:rPr>
+      </w:pPr>
+      <w:r>
+        <w:rPr>
+          <w:rFonts w:ascii="Arial" w:hAnsi="Arial" w:cs="Arial"/>
+          <w:noProof/>
+          <w:sz w:val="24"/>
+          <w:lang w:eastAsia="es-ES"/>
+        </w:rPr>
+        <w:lastRenderedPageBreak/>
+        <w:t>Ahora como se planteó la clase usuario:</w:t>
+      </w:r>
+    </w:p>
+    <w:p>
+      <w:pPr>
         <w:rPr>
           <w:rFonts w:ascii="Arial" w:hAnsi="Arial" w:cs="Arial"/>
           <w:sz w:val="24"/>
@@ -1195,360 +1384,6 @@
             <wp:extent cx="5400040" cy="3037840"/>
             <wp:effectExtent l="0" t="0" r="0" b="0"/>
             <wp:docPr id="3" name="Picture 3"/>
-            <wp:cNvGraphicFramePr>
-              <a:graphicFrameLocks xmlns:a="http://schemas.openxmlformats.org/drawingml/2006/main" noChangeAspect="1"/>
-            </wp:cNvGraphicFramePr>
-            <a:graphic xmlns:a="http://schemas.openxmlformats.org/drawingml/2006/main">
-              <a:graphicData uri="http://schemas.openxmlformats.org/drawingml/2006/picture">
-                <pic:pic xmlns:pic="http://schemas.openxmlformats.org/drawingml/2006/picture">
-                  <pic:nvPicPr>
-                    <pic:cNvPr id="1" name=""/>
-                    <pic:cNvPicPr/>
-                  </pic:nvPicPr>
-                  <pic:blipFill>
-                    <a:blip r:embed="rId7"/>
-                    <a:stretch>
-                      <a:fillRect/>
-                    </a:stretch>
-                  </pic:blipFill>
-                  <pic:spPr>
-                    <a:xfrm>
-                      <a:off x="0" y="0"/>
-                      <a:ext cx="5400040" cy="3037840"/>
-                    </a:xfrm>
-                    <a:prstGeom prst="rect">
-                      <a:avLst/>
-                    </a:prstGeom>
-                  </pic:spPr>
-                </pic:pic>
-              </a:graphicData>
-            </a:graphic>
-          </wp:inline>
-        </w:drawing>
-      </w:r>
-    </w:p>
-    <w:p>
-      <w:pPr>
-        <w:jc w:val="both"/>
-        <w:rPr>
-          <w:rFonts w:ascii="Arial" w:hAnsi="Arial" w:cs="Arial"/>
-          <w:sz w:val="24"/>
-          <w:lang w:val="es-CO"/>
-        </w:rPr>
-      </w:pPr>
-      <w:r>
-        <w:rPr>
-          <w:rFonts w:ascii="Arial" w:hAnsi="Arial" w:cs="Arial"/>
-          <w:sz w:val="24"/>
-          <w:lang w:val="es-CO"/>
-        </w:rPr>
-        <w:t xml:space="preserve">Para la creación de estos productos se definió </w:t>
-      </w:r>
-      <w:proofErr w:type="spellStart"/>
-      <w:r>
-        <w:rPr>
-          <w:rFonts w:ascii="Arial" w:hAnsi="Arial" w:cs="Arial"/>
-          <w:sz w:val="24"/>
-          <w:lang w:val="es-CO"/>
-        </w:rPr>
-        <w:t>UsuarioFactory</w:t>
-      </w:r>
-      <w:proofErr w:type="spellEnd"/>
-      <w:r>
-        <w:rPr>
-          <w:rFonts w:ascii="Arial" w:hAnsi="Arial" w:cs="Arial"/>
-          <w:sz w:val="24"/>
-          <w:lang w:val="es-CO"/>
-        </w:rPr>
-        <w:t xml:space="preserve">, una clase abstracta que declara el </w:t>
-      </w:r>
-      <w:proofErr w:type="spellStart"/>
-      <w:r>
-        <w:rPr>
-          <w:rFonts w:ascii="Arial" w:hAnsi="Arial" w:cs="Arial"/>
-          <w:sz w:val="24"/>
-          <w:lang w:val="es-CO"/>
-        </w:rPr>
-        <w:t>factory</w:t>
-      </w:r>
-      <w:proofErr w:type="spellEnd"/>
-      <w:r>
-        <w:rPr>
-          <w:rFonts w:ascii="Arial" w:hAnsi="Arial" w:cs="Arial"/>
-          <w:sz w:val="24"/>
-          <w:lang w:val="es-CO"/>
-        </w:rPr>
-        <w:t xml:space="preserve"> </w:t>
-      </w:r>
-      <w:proofErr w:type="spellStart"/>
-      <w:r>
-        <w:rPr>
-          <w:rFonts w:ascii="Arial" w:hAnsi="Arial" w:cs="Arial"/>
-          <w:sz w:val="24"/>
-          <w:lang w:val="es-CO"/>
-        </w:rPr>
-        <w:t>m</w:t>
-      </w:r>
-      <w:r>
-        <w:rPr>
-          <w:rFonts w:ascii="Arial" w:hAnsi="Arial" w:cs="Arial"/>
-          <w:sz w:val="24"/>
-          <w:lang w:val="es-CO"/>
-        </w:rPr>
-        <w:t>ethod</w:t>
-      </w:r>
-      <w:proofErr w:type="spellEnd"/>
-      <w:r>
-        <w:rPr>
-          <w:rFonts w:ascii="Arial" w:hAnsi="Arial" w:cs="Arial"/>
-          <w:sz w:val="24"/>
-          <w:lang w:val="es-CO"/>
-        </w:rPr>
-        <w:t xml:space="preserve"> </w:t>
-      </w:r>
-      <w:proofErr w:type="spellStart"/>
-      <w:proofErr w:type="gramStart"/>
-      <w:r>
-        <w:rPr>
-          <w:rFonts w:ascii="Arial" w:hAnsi="Arial" w:cs="Arial"/>
-          <w:sz w:val="24"/>
-          <w:lang w:val="es-CO"/>
-        </w:rPr>
-        <w:t>crearUsuarioEspecifico</w:t>
-      </w:r>
-      <w:proofErr w:type="spellEnd"/>
-      <w:r>
-        <w:rPr>
-          <w:rFonts w:ascii="Arial" w:hAnsi="Arial" w:cs="Arial"/>
-          <w:sz w:val="24"/>
-          <w:lang w:val="es-CO"/>
-        </w:rPr>
-        <w:t>(</w:t>
-      </w:r>
-      <w:proofErr w:type="gramEnd"/>
-      <w:r>
-        <w:rPr>
-          <w:rFonts w:ascii="Arial" w:hAnsi="Arial" w:cs="Arial"/>
-          <w:sz w:val="24"/>
-          <w:lang w:val="es-CO"/>
-        </w:rPr>
-        <w:t>) sin implementación, y un métod</w:t>
-      </w:r>
-      <w:r>
-        <w:rPr>
-          <w:rFonts w:ascii="Arial" w:hAnsi="Arial" w:cs="Arial"/>
-          <w:sz w:val="24"/>
-          <w:lang w:val="es-CO"/>
-        </w:rPr>
-        <w:t xml:space="preserve">o plantilla </w:t>
-      </w:r>
-      <w:proofErr w:type="spellStart"/>
-      <w:r>
-        <w:rPr>
-          <w:rFonts w:ascii="Arial" w:hAnsi="Arial" w:cs="Arial"/>
-          <w:sz w:val="24"/>
-          <w:lang w:val="es-CO"/>
-        </w:rPr>
-        <w:t>registrarUsuario</w:t>
-      </w:r>
-      <w:proofErr w:type="spellEnd"/>
-      <w:r>
-        <w:rPr>
-          <w:rFonts w:ascii="Arial" w:hAnsi="Arial" w:cs="Arial"/>
-          <w:sz w:val="24"/>
-          <w:lang w:val="es-CO"/>
-        </w:rPr>
-        <w:t>(</w:t>
-      </w:r>
-      <w:r>
-        <w:rPr>
-          <w:rFonts w:ascii="Arial" w:hAnsi="Arial" w:cs="Arial"/>
-          <w:sz w:val="24"/>
-          <w:lang w:val="es-CO"/>
-        </w:rPr>
-        <w:t xml:space="preserve">) que invoca a ese </w:t>
-      </w:r>
-      <w:proofErr w:type="spellStart"/>
-      <w:r>
-        <w:rPr>
-          <w:rFonts w:ascii="Arial" w:hAnsi="Arial" w:cs="Arial"/>
-          <w:sz w:val="24"/>
-          <w:lang w:val="es-CO"/>
-        </w:rPr>
-        <w:t>factory</w:t>
-      </w:r>
-      <w:proofErr w:type="spellEnd"/>
-      <w:r>
-        <w:rPr>
-          <w:rFonts w:ascii="Arial" w:hAnsi="Arial" w:cs="Arial"/>
-          <w:sz w:val="24"/>
-          <w:lang w:val="es-CO"/>
-        </w:rPr>
-        <w:t xml:space="preserve"> </w:t>
-      </w:r>
-      <w:proofErr w:type="spellStart"/>
-      <w:r>
-        <w:rPr>
-          <w:rFonts w:ascii="Arial" w:hAnsi="Arial" w:cs="Arial"/>
-          <w:sz w:val="24"/>
-          <w:lang w:val="es-CO"/>
-        </w:rPr>
-        <w:t>method</w:t>
-      </w:r>
-      <w:proofErr w:type="spellEnd"/>
-      <w:r>
-        <w:rPr>
-          <w:rFonts w:ascii="Arial" w:hAnsi="Arial" w:cs="Arial"/>
-          <w:sz w:val="24"/>
-          <w:lang w:val="es-CO"/>
-        </w:rPr>
-        <w:t>. Sobre esta base se impleme</w:t>
-      </w:r>
-      <w:r>
-        <w:rPr>
-          <w:rFonts w:ascii="Arial" w:hAnsi="Arial" w:cs="Arial"/>
-          <w:sz w:val="24"/>
-          <w:lang w:val="es-CO"/>
-        </w:rPr>
-        <w:t xml:space="preserve">ntaron tres </w:t>
-      </w:r>
-      <w:proofErr w:type="spellStart"/>
-      <w:r>
-        <w:rPr>
-          <w:rFonts w:ascii="Arial" w:hAnsi="Arial" w:cs="Arial"/>
-          <w:sz w:val="24"/>
-          <w:lang w:val="es-CO"/>
-        </w:rPr>
-        <w:t>creators</w:t>
-      </w:r>
-      <w:proofErr w:type="spellEnd"/>
-      <w:r>
-        <w:rPr>
-          <w:rFonts w:ascii="Arial" w:hAnsi="Arial" w:cs="Arial"/>
-          <w:sz w:val="24"/>
-          <w:lang w:val="es-CO"/>
-        </w:rPr>
-        <w:t xml:space="preserve"> concretos </w:t>
-      </w:r>
-      <w:proofErr w:type="spellStart"/>
-      <w:r>
-        <w:rPr>
-          <w:rFonts w:ascii="Arial" w:hAnsi="Arial" w:cs="Arial"/>
-          <w:sz w:val="24"/>
-          <w:lang w:val="es-CO"/>
-        </w:rPr>
-        <w:t>InstructorFactory</w:t>
-      </w:r>
-      <w:proofErr w:type="spellEnd"/>
-      <w:r>
-        <w:rPr>
-          <w:rFonts w:ascii="Arial" w:hAnsi="Arial" w:cs="Arial"/>
-          <w:sz w:val="24"/>
-          <w:lang w:val="es-CO"/>
-        </w:rPr>
-        <w:t xml:space="preserve">, </w:t>
-      </w:r>
-      <w:proofErr w:type="spellStart"/>
-      <w:r>
-        <w:rPr>
-          <w:rFonts w:ascii="Arial" w:hAnsi="Arial" w:cs="Arial"/>
-          <w:sz w:val="24"/>
-          <w:lang w:val="es-CO"/>
-        </w:rPr>
-        <w:t>EstudianteFactory</w:t>
-      </w:r>
-      <w:proofErr w:type="spellEnd"/>
-      <w:r>
-        <w:rPr>
-          <w:rFonts w:ascii="Arial" w:hAnsi="Arial" w:cs="Arial"/>
-          <w:sz w:val="24"/>
-          <w:lang w:val="es-CO"/>
-        </w:rPr>
-        <w:t xml:space="preserve"> y</w:t>
-      </w:r>
-      <w:r>
-        <w:rPr>
-          <w:rFonts w:ascii="Arial" w:hAnsi="Arial" w:cs="Arial"/>
-          <w:sz w:val="24"/>
-          <w:lang w:val="es-CO"/>
-        </w:rPr>
-        <w:t xml:space="preserve"> </w:t>
-      </w:r>
-      <w:proofErr w:type="spellStart"/>
-      <w:r>
-        <w:rPr>
-          <w:rFonts w:ascii="Arial" w:hAnsi="Arial" w:cs="Arial"/>
-          <w:sz w:val="24"/>
-          <w:lang w:val="es-CO"/>
-        </w:rPr>
-        <w:t>AdministradorFactory</w:t>
-      </w:r>
-      <w:proofErr w:type="spellEnd"/>
-      <w:r>
-        <w:rPr>
-          <w:rFonts w:ascii="Arial" w:hAnsi="Arial" w:cs="Arial"/>
-          <w:sz w:val="24"/>
-          <w:lang w:val="es-CO"/>
-        </w:rPr>
-        <w:t>, cada uno sobrescrib</w:t>
-      </w:r>
-      <w:r>
-        <w:rPr>
-          <w:rFonts w:ascii="Arial" w:hAnsi="Arial" w:cs="Arial"/>
-          <w:sz w:val="24"/>
-          <w:lang w:val="es-CO"/>
-        </w:rPr>
-        <w:t xml:space="preserve">iendo </w:t>
-      </w:r>
-      <w:proofErr w:type="spellStart"/>
-      <w:proofErr w:type="gramStart"/>
-      <w:r>
-        <w:rPr>
-          <w:rFonts w:ascii="Arial" w:hAnsi="Arial" w:cs="Arial"/>
-          <w:sz w:val="24"/>
-          <w:lang w:val="es-CO"/>
-        </w:rPr>
-        <w:t>crearUsuarioEspecifico</w:t>
-      </w:r>
-      <w:proofErr w:type="spellEnd"/>
-      <w:r>
-        <w:rPr>
-          <w:rFonts w:ascii="Arial" w:hAnsi="Arial" w:cs="Arial"/>
-          <w:sz w:val="24"/>
-          <w:lang w:val="es-CO"/>
-        </w:rPr>
-        <w:t>(</w:t>
-      </w:r>
-      <w:proofErr w:type="gramEnd"/>
-      <w:r>
-        <w:rPr>
-          <w:rFonts w:ascii="Arial" w:hAnsi="Arial" w:cs="Arial"/>
-          <w:sz w:val="24"/>
-          <w:lang w:val="es-CO"/>
-        </w:rPr>
-        <w:t>) para instanciar y devolver su producto correspondiente.</w:t>
-      </w:r>
-    </w:p>
-    <w:p>
-      <w:pPr>
-        <w:jc w:val="both"/>
-        <w:rPr>
-          <w:rFonts w:ascii="Arial" w:hAnsi="Arial" w:cs="Arial"/>
-          <w:sz w:val="24"/>
-          <w:lang w:val="es-CO"/>
-        </w:rPr>
-      </w:pPr>
-      <w:r>
-        <w:rPr>
-          <w:rFonts w:ascii="Arial" w:hAnsi="Arial" w:cs="Arial"/>
-          <w:sz w:val="24"/>
-          <w:lang w:val="es-CO"/>
-        </w:rPr>
-        <w:drawing>
-          <wp:inline distT="0" distB="0" distL="0" distR="0" wp14:anchorId="34E5B51D" wp14:editId="5C0F61F7">
-            <wp:extent cx="5400040" cy="2314575"/>
-            <wp:effectExtent l="0" t="0" r="0" b="9525"/>
-            <wp:docPr id="4" name="Picture 4"/>
             <wp:cNvGraphicFramePr>
               <a:graphicFrameLocks xmlns:a="http://schemas.openxmlformats.org/drawingml/2006/main" noChangeAspect="1"/>
             </wp:cNvGraphicFramePr>
@@ -1568,7 +1403,7 @@
                   <pic:spPr>
                     <a:xfrm>
                       <a:off x="0" y="0"/>
-                      <a:ext cx="5400040" cy="2314575"/>
+                      <a:ext cx="5400040" cy="3037840"/>
                     </a:xfrm>
                     <a:prstGeom prst="rect">
                       <a:avLst/>
@@ -1596,12 +1431,314 @@
           <w:sz w:val="24"/>
           <w:lang w:val="es-CO"/>
         </w:rPr>
-        <w:lastRenderedPageBreak/>
+        <w:t xml:space="preserve">Para la creación de estos productos se definió </w:t>
+      </w:r>
+      <w:proofErr w:type="spellStart"/>
+      <w:r>
+        <w:rPr>
+          <w:rFonts w:ascii="Arial" w:hAnsi="Arial" w:cs="Arial"/>
+          <w:sz w:val="24"/>
+          <w:lang w:val="es-CO"/>
+        </w:rPr>
+        <w:t>UsuarioFactory</w:t>
+      </w:r>
+      <w:proofErr w:type="spellEnd"/>
+      <w:r>
+        <w:rPr>
+          <w:rFonts w:ascii="Arial" w:hAnsi="Arial" w:cs="Arial"/>
+          <w:sz w:val="24"/>
+          <w:lang w:val="es-CO"/>
+        </w:rPr>
+        <w:t xml:space="preserve">, una clase abstracta que declara el </w:t>
+      </w:r>
+      <w:proofErr w:type="spellStart"/>
+      <w:r>
+        <w:rPr>
+          <w:rFonts w:ascii="Arial" w:hAnsi="Arial" w:cs="Arial"/>
+          <w:sz w:val="24"/>
+          <w:lang w:val="es-CO"/>
+        </w:rPr>
+        <w:t>factory</w:t>
+      </w:r>
+      <w:proofErr w:type="spellEnd"/>
+      <w:r>
+        <w:rPr>
+          <w:rFonts w:ascii="Arial" w:hAnsi="Arial" w:cs="Arial"/>
+          <w:sz w:val="24"/>
+          <w:lang w:val="es-CO"/>
+        </w:rPr>
+        <w:t xml:space="preserve"> </w:t>
+      </w:r>
+      <w:proofErr w:type="spellStart"/>
+      <w:r>
+        <w:rPr>
+          <w:rFonts w:ascii="Arial" w:hAnsi="Arial" w:cs="Arial"/>
+          <w:sz w:val="24"/>
+          <w:lang w:val="es-CO"/>
+        </w:rPr>
+        <w:t>m</w:t>
+      </w:r>
+      <w:r>
+        <w:rPr>
+          <w:rFonts w:ascii="Arial" w:hAnsi="Arial" w:cs="Arial"/>
+          <w:sz w:val="24"/>
+          <w:lang w:val="es-CO"/>
+        </w:rPr>
+        <w:t>ethod</w:t>
+      </w:r>
+      <w:proofErr w:type="spellEnd"/>
+      <w:r>
+        <w:rPr>
+          <w:rFonts w:ascii="Arial" w:hAnsi="Arial" w:cs="Arial"/>
+          <w:sz w:val="24"/>
+          <w:lang w:val="es-CO"/>
+        </w:rPr>
+        <w:t xml:space="preserve"> </w:t>
+      </w:r>
+      <w:proofErr w:type="spellStart"/>
+      <w:proofErr w:type="gramStart"/>
+      <w:r>
+        <w:rPr>
+          <w:rFonts w:ascii="Arial" w:hAnsi="Arial" w:cs="Arial"/>
+          <w:sz w:val="24"/>
+          <w:lang w:val="es-CO"/>
+        </w:rPr>
+        <w:t>crearUsuarioEspecifico</w:t>
+      </w:r>
+      <w:proofErr w:type="spellEnd"/>
+      <w:r>
+        <w:rPr>
+          <w:rFonts w:ascii="Arial" w:hAnsi="Arial" w:cs="Arial"/>
+          <w:sz w:val="24"/>
+          <w:lang w:val="es-CO"/>
+        </w:rPr>
+        <w:t>(</w:t>
+      </w:r>
+      <w:proofErr w:type="gramEnd"/>
+      <w:r>
+        <w:rPr>
+          <w:rFonts w:ascii="Arial" w:hAnsi="Arial" w:cs="Arial"/>
+          <w:sz w:val="24"/>
+          <w:lang w:val="es-CO"/>
+        </w:rPr>
+        <w:t>) sin implementación, y un métod</w:t>
+      </w:r>
+      <w:r>
+        <w:rPr>
+          <w:rFonts w:ascii="Arial" w:hAnsi="Arial" w:cs="Arial"/>
+          <w:sz w:val="24"/>
+          <w:lang w:val="es-CO"/>
+        </w:rPr>
+        <w:t xml:space="preserve">o plantilla </w:t>
+      </w:r>
+      <w:proofErr w:type="spellStart"/>
+      <w:r>
+        <w:rPr>
+          <w:rFonts w:ascii="Arial" w:hAnsi="Arial" w:cs="Arial"/>
+          <w:sz w:val="24"/>
+          <w:lang w:val="es-CO"/>
+        </w:rPr>
+        <w:t>registrarUsuario</w:t>
+      </w:r>
+      <w:proofErr w:type="spellEnd"/>
+      <w:r>
+        <w:rPr>
+          <w:rFonts w:ascii="Arial" w:hAnsi="Arial" w:cs="Arial"/>
+          <w:sz w:val="24"/>
+          <w:lang w:val="es-CO"/>
+        </w:rPr>
+        <w:t>(</w:t>
+      </w:r>
+      <w:r>
+        <w:rPr>
+          <w:rFonts w:ascii="Arial" w:hAnsi="Arial" w:cs="Arial"/>
+          <w:sz w:val="24"/>
+          <w:lang w:val="es-CO"/>
+        </w:rPr>
+        <w:t xml:space="preserve">) que invoca a ese </w:t>
+      </w:r>
+      <w:proofErr w:type="spellStart"/>
+      <w:r>
+        <w:rPr>
+          <w:rFonts w:ascii="Arial" w:hAnsi="Arial" w:cs="Arial"/>
+          <w:sz w:val="24"/>
+          <w:lang w:val="es-CO"/>
+        </w:rPr>
+        <w:t>factory</w:t>
+      </w:r>
+      <w:proofErr w:type="spellEnd"/>
+      <w:r>
+        <w:rPr>
+          <w:rFonts w:ascii="Arial" w:hAnsi="Arial" w:cs="Arial"/>
+          <w:sz w:val="24"/>
+          <w:lang w:val="es-CO"/>
+        </w:rPr>
+        <w:t xml:space="preserve"> </w:t>
+      </w:r>
+      <w:proofErr w:type="spellStart"/>
+      <w:r>
+        <w:rPr>
+          <w:rFonts w:ascii="Arial" w:hAnsi="Arial" w:cs="Arial"/>
+          <w:sz w:val="24"/>
+          <w:lang w:val="es-CO"/>
+        </w:rPr>
+        <w:t>method</w:t>
+      </w:r>
+      <w:proofErr w:type="spellEnd"/>
+      <w:r>
+        <w:rPr>
+          <w:rFonts w:ascii="Arial" w:hAnsi="Arial" w:cs="Arial"/>
+          <w:sz w:val="24"/>
+          <w:lang w:val="es-CO"/>
+        </w:rPr>
+        <w:t>. Sobre esta base se impleme</w:t>
+      </w:r>
+      <w:r>
+        <w:rPr>
+          <w:rFonts w:ascii="Arial" w:hAnsi="Arial" w:cs="Arial"/>
+          <w:sz w:val="24"/>
+          <w:lang w:val="es-CO"/>
+        </w:rPr>
+        <w:t xml:space="preserve">ntaron tres </w:t>
+      </w:r>
+      <w:proofErr w:type="spellStart"/>
+      <w:r>
+        <w:rPr>
+          <w:rFonts w:ascii="Arial" w:hAnsi="Arial" w:cs="Arial"/>
+          <w:sz w:val="24"/>
+          <w:lang w:val="es-CO"/>
+        </w:rPr>
+        <w:t>creators</w:t>
+      </w:r>
+      <w:proofErr w:type="spellEnd"/>
+      <w:r>
+        <w:rPr>
+          <w:rFonts w:ascii="Arial" w:hAnsi="Arial" w:cs="Arial"/>
+          <w:sz w:val="24"/>
+          <w:lang w:val="es-CO"/>
+        </w:rPr>
+        <w:t xml:space="preserve"> concretos </w:t>
+      </w:r>
+      <w:proofErr w:type="spellStart"/>
+      <w:r>
+        <w:rPr>
+          <w:rFonts w:ascii="Arial" w:hAnsi="Arial" w:cs="Arial"/>
+          <w:sz w:val="24"/>
+          <w:lang w:val="es-CO"/>
+        </w:rPr>
+        <w:t>InstructorFactory</w:t>
+      </w:r>
+      <w:proofErr w:type="spellEnd"/>
+      <w:r>
+        <w:rPr>
+          <w:rFonts w:ascii="Arial" w:hAnsi="Arial" w:cs="Arial"/>
+          <w:sz w:val="24"/>
+          <w:lang w:val="es-CO"/>
+        </w:rPr>
+        <w:t xml:space="preserve">, </w:t>
+      </w:r>
+      <w:proofErr w:type="spellStart"/>
+      <w:r>
+        <w:rPr>
+          <w:rFonts w:ascii="Arial" w:hAnsi="Arial" w:cs="Arial"/>
+          <w:sz w:val="24"/>
+          <w:lang w:val="es-CO"/>
+        </w:rPr>
+        <w:t>EstudianteFactory</w:t>
+      </w:r>
+      <w:proofErr w:type="spellEnd"/>
+      <w:r>
+        <w:rPr>
+          <w:rFonts w:ascii="Arial" w:hAnsi="Arial" w:cs="Arial"/>
+          <w:sz w:val="24"/>
+          <w:lang w:val="es-CO"/>
+        </w:rPr>
+        <w:t xml:space="preserve"> y</w:t>
+      </w:r>
+      <w:r>
+        <w:rPr>
+          <w:rFonts w:ascii="Arial" w:hAnsi="Arial" w:cs="Arial"/>
+          <w:sz w:val="24"/>
+          <w:lang w:val="es-CO"/>
+        </w:rPr>
+        <w:t xml:space="preserve"> </w:t>
+      </w:r>
+      <w:proofErr w:type="spellStart"/>
+      <w:r>
+        <w:rPr>
+          <w:rFonts w:ascii="Arial" w:hAnsi="Arial" w:cs="Arial"/>
+          <w:sz w:val="24"/>
+          <w:lang w:val="es-CO"/>
+        </w:rPr>
+        <w:t>AdministradorFactory</w:t>
+      </w:r>
+      <w:proofErr w:type="spellEnd"/>
+      <w:r>
+        <w:rPr>
+          <w:rFonts w:ascii="Arial" w:hAnsi="Arial" w:cs="Arial"/>
+          <w:sz w:val="24"/>
+          <w:lang w:val="es-CO"/>
+        </w:rPr>
+        <w:t>, cada uno sobrescrib</w:t>
+      </w:r>
+      <w:r>
+        <w:rPr>
+          <w:rFonts w:ascii="Arial" w:hAnsi="Arial" w:cs="Arial"/>
+          <w:sz w:val="24"/>
+          <w:lang w:val="es-CO"/>
+        </w:rPr>
+        <w:t xml:space="preserve">iendo </w:t>
+      </w:r>
+      <w:proofErr w:type="spellStart"/>
+      <w:proofErr w:type="gramStart"/>
+      <w:r>
+        <w:rPr>
+          <w:rFonts w:ascii="Arial" w:hAnsi="Arial" w:cs="Arial"/>
+          <w:sz w:val="24"/>
+          <w:lang w:val="es-CO"/>
+        </w:rPr>
+        <w:t>crearUsuarioEspecifico</w:t>
+      </w:r>
+      <w:proofErr w:type="spellEnd"/>
+      <w:r>
+        <w:rPr>
+          <w:rFonts w:ascii="Arial" w:hAnsi="Arial" w:cs="Arial"/>
+          <w:sz w:val="24"/>
+          <w:lang w:val="es-CO"/>
+        </w:rPr>
+        <w:t>(</w:t>
+      </w:r>
+      <w:proofErr w:type="gramEnd"/>
+      <w:r>
+        <w:rPr>
+          <w:rFonts w:ascii="Arial" w:hAnsi="Arial" w:cs="Arial"/>
+          <w:sz w:val="24"/>
+          <w:lang w:val="es-CO"/>
+        </w:rPr>
+        <w:t>) para instanciar y devolver su producto correspondiente.</w:t>
+      </w:r>
+    </w:p>
+    <w:p>
+      <w:pPr>
+        <w:jc w:val="both"/>
+        <w:rPr>
+          <w:rFonts w:ascii="Arial" w:hAnsi="Arial" w:cs="Arial"/>
+          <w:sz w:val="24"/>
+          <w:lang w:val="es-CO"/>
+        </w:rPr>
+      </w:pPr>
+      <w:r>
+        <w:rPr>
+          <w:rFonts w:ascii="Arial" w:hAnsi="Arial" w:cs="Arial"/>
+          <w:noProof/>
+          <w:sz w:val="24"/>
+          <w:lang w:eastAsia="es-ES"/>
+        </w:rPr>
         <w:drawing>
-          <wp:inline distT="0" distB="0" distL="0" distR="0" wp14:anchorId="73ADDA41" wp14:editId="1A4858AD">
-            <wp:extent cx="5400040" cy="1812290"/>
-            <wp:effectExtent l="0" t="0" r="0" b="0"/>
-            <wp:docPr id="5" name="Picture 5"/>
+          <wp:inline distT="0" distB="0" distL="0" distR="0" wp14:anchorId="34E5B51D" wp14:editId="5C0F61F7">
+            <wp:extent cx="5400040" cy="2314575"/>
+            <wp:effectExtent l="0" t="0" r="0" b="9525"/>
+            <wp:docPr id="4" name="Picture 4"/>
             <wp:cNvGraphicFramePr>
               <a:graphicFrameLocks xmlns:a="http://schemas.openxmlformats.org/drawingml/2006/main" noChangeAspect="1"/>
             </wp:cNvGraphicFramePr>
@@ -1621,7 +1758,7 @@
                   <pic:spPr>
                     <a:xfrm>
                       <a:off x="0" y="0"/>
-                      <a:ext cx="5400040" cy="1812290"/>
+                      <a:ext cx="5400040" cy="2314575"/>
                     </a:xfrm>
                     <a:prstGeom prst="rect">
                       <a:avLst/>
@@ -1646,14 +1783,16 @@
       <w:r>
         <w:rPr>
           <w:rFonts w:ascii="Arial" w:hAnsi="Arial" w:cs="Arial"/>
-          <w:sz w:val="24"/>
-          <w:lang w:val="es-CO"/>
-        </w:rPr>
+          <w:noProof/>
+          <w:sz w:val="24"/>
+          <w:lang w:eastAsia="es-ES"/>
+        </w:rPr>
+        <w:lastRenderedPageBreak/>
         <w:drawing>
-          <wp:inline distT="0" distB="0" distL="0" distR="0" wp14:anchorId="407E6F3B" wp14:editId="629AAD85">
-            <wp:extent cx="5400040" cy="1864995"/>
-            <wp:effectExtent l="0" t="0" r="0" b="1905"/>
-            <wp:docPr id="6" name="Picture 6"/>
+          <wp:inline distT="0" distB="0" distL="0" distR="0" wp14:anchorId="73ADDA41" wp14:editId="1A4858AD">
+            <wp:extent cx="5400040" cy="1812290"/>
+            <wp:effectExtent l="0" t="0" r="0" b="0"/>
+            <wp:docPr id="5" name="Picture 5"/>
             <wp:cNvGraphicFramePr>
               <a:graphicFrameLocks xmlns:a="http://schemas.openxmlformats.org/drawingml/2006/main" noChangeAspect="1"/>
             </wp:cNvGraphicFramePr>
@@ -1673,7 +1812,7 @@
                   <pic:spPr>
                     <a:xfrm>
                       <a:off x="0" y="0"/>
-                      <a:ext cx="5400040" cy="1864995"/>
+                      <a:ext cx="5400040" cy="1812290"/>
                     </a:xfrm>
                     <a:prstGeom prst="rect">
                       <a:avLst/>
@@ -1698,14 +1837,15 @@
       <w:r>
         <w:rPr>
           <w:rFonts w:ascii="Arial" w:hAnsi="Arial" w:cs="Arial"/>
-          <w:sz w:val="24"/>
-          <w:lang w:val="es-CO"/>
+          <w:noProof/>
+          <w:sz w:val="24"/>
+          <w:lang w:eastAsia="es-ES"/>
         </w:rPr>
         <w:drawing>
-          <wp:inline distT="0" distB="0" distL="0" distR="0" wp14:anchorId="78D9F5A8" wp14:editId="37A03478">
-            <wp:extent cx="5400040" cy="1854835"/>
-            <wp:effectExtent l="0" t="0" r="0" b="0"/>
-            <wp:docPr id="7" name="Picture 7"/>
+          <wp:inline distT="0" distB="0" distL="0" distR="0" wp14:anchorId="407E6F3B" wp14:editId="629AAD85">
+            <wp:extent cx="5400040" cy="1864995"/>
+            <wp:effectExtent l="0" t="0" r="0" b="1905"/>
+            <wp:docPr id="6" name="Picture 6"/>
             <wp:cNvGraphicFramePr>
               <a:graphicFrameLocks xmlns:a="http://schemas.openxmlformats.org/drawingml/2006/main" noChangeAspect="1"/>
             </wp:cNvGraphicFramePr>
@@ -1725,7 +1865,7 @@
                   <pic:spPr>
                     <a:xfrm>
                       <a:off x="0" y="0"/>
-                      <a:ext cx="5400040" cy="1854835"/>
+                      <a:ext cx="5400040" cy="1864995"/>
                     </a:xfrm>
                     <a:prstGeom prst="rect">
                       <a:avLst/>
@@ -1750,151 +1890,15 @@
       <w:r>
         <w:rPr>
           <w:rFonts w:ascii="Arial" w:hAnsi="Arial" w:cs="Arial"/>
-          <w:sz w:val="24"/>
-          <w:lang w:val="es-CO"/>
-        </w:rPr>
-        <w:t xml:space="preserve">Cada una de estas </w:t>
-      </w:r>
-      <w:proofErr w:type="spellStart"/>
-      <w:r>
-        <w:rPr>
-          <w:rFonts w:ascii="Arial" w:hAnsi="Arial" w:cs="Arial"/>
-          <w:sz w:val="24"/>
-          <w:lang w:val="es-CO"/>
-        </w:rPr>
-        <w:t>factories</w:t>
-      </w:r>
-      <w:proofErr w:type="spellEnd"/>
-      <w:r>
-        <w:rPr>
-          <w:rFonts w:ascii="Arial" w:hAnsi="Arial" w:cs="Arial"/>
-          <w:sz w:val="24"/>
-          <w:lang w:val="es-CO"/>
-        </w:rPr>
-        <w:t xml:space="preserve"> concretas se registró como componente de Spring (@</w:t>
-      </w:r>
-      <w:proofErr w:type="spellStart"/>
-      <w:r>
-        <w:rPr>
-          <w:rFonts w:ascii="Arial" w:hAnsi="Arial" w:cs="Arial"/>
-          <w:sz w:val="24"/>
-          <w:lang w:val="es-CO"/>
-        </w:rPr>
-        <w:t>Component</w:t>
-      </w:r>
-      <w:proofErr w:type="spellEnd"/>
-      <w:r>
-        <w:rPr>
-          <w:rFonts w:ascii="Arial" w:hAnsi="Arial" w:cs="Arial"/>
-          <w:sz w:val="24"/>
-          <w:lang w:val="es-CO"/>
-        </w:rPr>
-        <w:t xml:space="preserve">), lo que permite que el </w:t>
-      </w:r>
-      <w:proofErr w:type="spellStart"/>
-      <w:r>
-        <w:rPr>
-          <w:rFonts w:ascii="Arial" w:hAnsi="Arial" w:cs="Arial"/>
-          <w:sz w:val="24"/>
-          <w:lang w:val="es-CO"/>
-        </w:rPr>
-        <w:t>framework</w:t>
-      </w:r>
-      <w:proofErr w:type="spellEnd"/>
-      <w:r>
-        <w:rPr>
-          <w:rFonts w:ascii="Arial" w:hAnsi="Arial" w:cs="Arial"/>
-          <w:sz w:val="24"/>
-          <w:lang w:val="es-CO"/>
-        </w:rPr>
-        <w:t xml:space="preserve"> las inyecte automáticamente como una lista en </w:t>
-      </w:r>
-      <w:proofErr w:type="spellStart"/>
-      <w:r>
-        <w:rPr>
-          <w:rFonts w:ascii="Arial" w:hAnsi="Arial" w:cs="Arial"/>
-          <w:sz w:val="24"/>
-          <w:lang w:val="es-CO"/>
-        </w:rPr>
-        <w:t>UsuarioFactoryProvider</w:t>
-      </w:r>
-      <w:proofErr w:type="spellEnd"/>
-      <w:r>
-        <w:rPr>
-          <w:rFonts w:ascii="Arial" w:hAnsi="Arial" w:cs="Arial"/>
-          <w:sz w:val="24"/>
-          <w:lang w:val="es-CO"/>
-        </w:rPr>
-        <w:t xml:space="preserve">. Esta clase construye internamente un mapa que asocia cada Rol con la </w:t>
-      </w:r>
-      <w:proofErr w:type="spellStart"/>
-      <w:r>
-        <w:rPr>
-          <w:rFonts w:ascii="Arial" w:hAnsi="Arial" w:cs="Arial"/>
-          <w:sz w:val="24"/>
-          <w:lang w:val="es-CO"/>
-        </w:rPr>
-        <w:t>factory</w:t>
-      </w:r>
-      <w:proofErr w:type="spellEnd"/>
-      <w:r>
-        <w:rPr>
-          <w:rFonts w:ascii="Arial" w:hAnsi="Arial" w:cs="Arial"/>
-          <w:sz w:val="24"/>
-          <w:lang w:val="es-CO"/>
-        </w:rPr>
-        <w:t xml:space="preserve"> que lo produce, exponiendo un método </w:t>
-      </w:r>
-      <w:proofErr w:type="spellStart"/>
-      <w:proofErr w:type="gramStart"/>
-      <w:r>
-        <w:rPr>
-          <w:rFonts w:ascii="Arial" w:hAnsi="Arial" w:cs="Arial"/>
-          <w:sz w:val="24"/>
-          <w:lang w:val="es-CO"/>
-        </w:rPr>
-        <w:t>getFactory</w:t>
-      </w:r>
-      <w:proofErr w:type="spellEnd"/>
-      <w:r>
-        <w:rPr>
-          <w:rFonts w:ascii="Arial" w:hAnsi="Arial" w:cs="Arial"/>
-          <w:sz w:val="24"/>
-          <w:lang w:val="es-CO"/>
-        </w:rPr>
-        <w:t>(</w:t>
-      </w:r>
-      <w:proofErr w:type="gramEnd"/>
-      <w:r>
-        <w:rPr>
-          <w:rFonts w:ascii="Arial" w:hAnsi="Arial" w:cs="Arial"/>
-          <w:sz w:val="24"/>
-          <w:lang w:val="es-CO"/>
-        </w:rPr>
-        <w:t>Rol rol) que devuelve la instancia adecuada.</w:t>
-      </w:r>
-    </w:p>
-    <w:p>
-      <w:pPr>
-        <w:jc w:val="both"/>
-        <w:rPr>
-          <w:rFonts w:ascii="Arial" w:hAnsi="Arial" w:cs="Arial"/>
-          <w:sz w:val="24"/>
-          <w:lang w:val="es-CO"/>
-        </w:rPr>
-      </w:pPr>
-      <w:r>
-        <w:rPr>
-          <w:rFonts w:ascii="Arial" w:hAnsi="Arial" w:cs="Arial"/>
-          <w:sz w:val="24"/>
-          <w:lang w:val="es-CO"/>
-        </w:rPr>
-        <w:lastRenderedPageBreak/>
+          <w:noProof/>
+          <w:sz w:val="24"/>
+          <w:lang w:eastAsia="es-ES"/>
+        </w:rPr>
         <w:drawing>
-          <wp:inline distT="0" distB="0" distL="0" distR="0" wp14:anchorId="2B1F6413" wp14:editId="65BE7884">
-            <wp:extent cx="5400040" cy="2129155"/>
-            <wp:effectExtent l="0" t="0" r="0" b="4445"/>
-            <wp:docPr id="8" name="Picture 8"/>
+          <wp:inline distT="0" distB="0" distL="0" distR="0" wp14:anchorId="78D9F5A8" wp14:editId="37A03478">
+            <wp:extent cx="5400040" cy="1854835"/>
+            <wp:effectExtent l="0" t="0" r="0" b="0"/>
+            <wp:docPr id="7" name="Picture 7"/>
             <wp:cNvGraphicFramePr>
               <a:graphicFrameLocks xmlns:a="http://schemas.openxmlformats.org/drawingml/2006/main" noChangeAspect="1"/>
             </wp:cNvGraphicFramePr>
@@ -1914,7 +1918,7 @@
                   <pic:spPr>
                     <a:xfrm>
                       <a:off x="0" y="0"/>
-                      <a:ext cx="5400040" cy="2129155"/>
+                      <a:ext cx="5400040" cy="1854835"/>
                     </a:xfrm>
                     <a:prstGeom prst="rect">
                       <a:avLst/>
@@ -1942,7 +1946,7 @@
           <w:sz w:val="24"/>
           <w:lang w:val="es-CO"/>
         </w:rPr>
-        <w:t xml:space="preserve">El flujo de ejecución queda así: el controlador recibe la solicitud de creación de usuario junto con el rol elegido, invoca </w:t>
+        <w:t xml:space="preserve">Cada una de estas </w:t>
       </w:r>
       <w:proofErr w:type="spellStart"/>
       <w:r>
@@ -1951,7 +1955,7 @@
           <w:sz w:val="24"/>
           <w:lang w:val="es-CO"/>
         </w:rPr>
-        <w:t>usuarioFactoryProvider.getFactory</w:t>
+        <w:t>factories</w:t>
       </w:r>
       <w:proofErr w:type="spellEnd"/>
       <w:r>
@@ -1960,7 +1964,7 @@
           <w:sz w:val="24"/>
           <w:lang w:val="es-CO"/>
         </w:rPr>
-        <w:t xml:space="preserve">(rol) para obtener la </w:t>
+        <w:t xml:space="preserve"> concretas se registró como componente de Spring (@</w:t>
       </w:r>
       <w:proofErr w:type="spellStart"/>
       <w:r>
@@ -1969,6 +1973,60 @@
           <w:sz w:val="24"/>
           <w:lang w:val="es-CO"/>
         </w:rPr>
+        <w:t>Component</w:t>
+      </w:r>
+      <w:proofErr w:type="spellEnd"/>
+      <w:r>
+        <w:rPr>
+          <w:rFonts w:ascii="Arial" w:hAnsi="Arial" w:cs="Arial"/>
+          <w:sz w:val="24"/>
+          <w:lang w:val="es-CO"/>
+        </w:rPr>
+        <w:t xml:space="preserve">), lo que permite que el </w:t>
+      </w:r>
+      <w:proofErr w:type="spellStart"/>
+      <w:r>
+        <w:rPr>
+          <w:rFonts w:ascii="Arial" w:hAnsi="Arial" w:cs="Arial"/>
+          <w:sz w:val="24"/>
+          <w:lang w:val="es-CO"/>
+        </w:rPr>
+        <w:t>framework</w:t>
+      </w:r>
+      <w:proofErr w:type="spellEnd"/>
+      <w:r>
+        <w:rPr>
+          <w:rFonts w:ascii="Arial" w:hAnsi="Arial" w:cs="Arial"/>
+          <w:sz w:val="24"/>
+          <w:lang w:val="es-CO"/>
+        </w:rPr>
+        <w:t xml:space="preserve"> las inyecte automáticamente como una lista en </w:t>
+      </w:r>
+      <w:proofErr w:type="spellStart"/>
+      <w:r>
+        <w:rPr>
+          <w:rFonts w:ascii="Arial" w:hAnsi="Arial" w:cs="Arial"/>
+          <w:sz w:val="24"/>
+          <w:lang w:val="es-CO"/>
+        </w:rPr>
+        <w:t>UsuarioFactoryProvider</w:t>
+      </w:r>
+      <w:proofErr w:type="spellEnd"/>
+      <w:r>
+        <w:rPr>
+          <w:rFonts w:ascii="Arial" w:hAnsi="Arial" w:cs="Arial"/>
+          <w:sz w:val="24"/>
+          <w:lang w:val="es-CO"/>
+        </w:rPr>
+        <w:t xml:space="preserve">. Esta clase construye internamente un mapa que asocia cada Rol con la </w:t>
+      </w:r>
+      <w:proofErr w:type="spellStart"/>
+      <w:r>
+        <w:rPr>
+          <w:rFonts w:ascii="Arial" w:hAnsi="Arial" w:cs="Arial"/>
+          <w:sz w:val="24"/>
+          <w:lang w:val="es-CO"/>
+        </w:rPr>
         <w:t>factory</w:t>
       </w:r>
       <w:proofErr w:type="spellEnd"/>
@@ -1978,33 +2036,7 @@
           <w:sz w:val="24"/>
           <w:lang w:val="es-CO"/>
         </w:rPr>
-        <w:t xml:space="preserve"> correspondiente, y sobre esa </w:t>
-      </w:r>
-      <w:proofErr w:type="spellStart"/>
-      <w:r>
-        <w:rPr>
-          <w:rFonts w:ascii="Arial" w:hAnsi="Arial" w:cs="Arial"/>
-          <w:sz w:val="24"/>
-          <w:lang w:val="es-CO"/>
-        </w:rPr>
-        <w:t>fact</w:t>
-      </w:r>
-      <w:r>
-        <w:rPr>
-          <w:rFonts w:ascii="Arial" w:hAnsi="Arial" w:cs="Arial"/>
-          <w:sz w:val="24"/>
-          <w:lang w:val="es-CO"/>
-        </w:rPr>
-        <w:t>ory</w:t>
-      </w:r>
-      <w:proofErr w:type="spellEnd"/>
-      <w:r>
-        <w:rPr>
-          <w:rFonts w:ascii="Arial" w:hAnsi="Arial" w:cs="Arial"/>
-          <w:sz w:val="24"/>
-          <w:lang w:val="es-CO"/>
-        </w:rPr>
-        <w:t xml:space="preserve"> llama a </w:t>
+        <w:t xml:space="preserve"> que lo produce, exponiendo un método </w:t>
       </w:r>
       <w:proofErr w:type="spellStart"/>
       <w:proofErr w:type="gramStart"/>
@@ -2014,7 +2046,7 @@
           <w:sz w:val="24"/>
           <w:lang w:val="es-CO"/>
         </w:rPr>
-        <w:t>registrarUsuario</w:t>
+        <w:t>getFactory</w:t>
       </w:r>
       <w:proofErr w:type="spellEnd"/>
       <w:r>
@@ -2032,119 +2064,31 @@
           <w:sz w:val="24"/>
           <w:lang w:val="es-CO"/>
         </w:rPr>
-        <w:t xml:space="preserve">). Este método ejecuta internamente el </w:t>
-      </w:r>
-      <w:proofErr w:type="spellStart"/>
-      <w:r>
-        <w:rPr>
-          <w:rFonts w:ascii="Arial" w:hAnsi="Arial" w:cs="Arial"/>
-          <w:sz w:val="24"/>
-          <w:lang w:val="es-CO"/>
-        </w:rPr>
-        <w:t>factory</w:t>
-      </w:r>
-      <w:proofErr w:type="spellEnd"/>
-      <w:r>
-        <w:rPr>
-          <w:rFonts w:ascii="Arial" w:hAnsi="Arial" w:cs="Arial"/>
-          <w:sz w:val="24"/>
-          <w:lang w:val="es-CO"/>
-        </w:rPr>
-        <w:t xml:space="preserve"> </w:t>
-      </w:r>
-      <w:proofErr w:type="spellStart"/>
-      <w:r>
-        <w:rPr>
-          <w:rFonts w:ascii="Arial" w:hAnsi="Arial" w:cs="Arial"/>
-          <w:sz w:val="24"/>
-          <w:lang w:val="es-CO"/>
-        </w:rPr>
-        <w:t>m</w:t>
-      </w:r>
-      <w:r>
-        <w:rPr>
-          <w:rFonts w:ascii="Arial" w:hAnsi="Arial" w:cs="Arial"/>
-          <w:sz w:val="24"/>
-          <w:lang w:val="es-CO"/>
-        </w:rPr>
-        <w:t>ethod</w:t>
-      </w:r>
-      <w:proofErr w:type="spellEnd"/>
-      <w:r>
-        <w:rPr>
-          <w:rFonts w:ascii="Arial" w:hAnsi="Arial" w:cs="Arial"/>
-          <w:sz w:val="24"/>
-          <w:lang w:val="es-CO"/>
-        </w:rPr>
-        <w:t xml:space="preserve"> </w:t>
-      </w:r>
-      <w:proofErr w:type="spellStart"/>
-      <w:proofErr w:type="gramStart"/>
-      <w:r>
-        <w:rPr>
-          <w:rFonts w:ascii="Arial" w:hAnsi="Arial" w:cs="Arial"/>
-          <w:sz w:val="24"/>
-          <w:lang w:val="es-CO"/>
-        </w:rPr>
-        <w:t>crearUsuarioEspecifico</w:t>
-      </w:r>
-      <w:proofErr w:type="spellEnd"/>
-      <w:r>
-        <w:rPr>
-          <w:rFonts w:ascii="Arial" w:hAnsi="Arial" w:cs="Arial"/>
-          <w:sz w:val="24"/>
-          <w:lang w:val="es-CO"/>
-        </w:rPr>
-        <w:t>(</w:t>
-      </w:r>
-      <w:proofErr w:type="gramEnd"/>
-      <w:r>
-        <w:rPr>
-          <w:rFonts w:ascii="Arial" w:hAnsi="Arial" w:cs="Arial"/>
-          <w:sz w:val="24"/>
-          <w:lang w:val="es-CO"/>
-        </w:rPr>
-        <w:t>), que retorna la instancia concreta de Usuario ya construida, la cual el controlador guarda en el repositorio.</w:t>
-      </w:r>
-    </w:p>
-    <w:p>
-      <w:pPr>
-        <w:jc w:val="both"/>
-        <w:rPr>
-          <w:rFonts w:ascii="Arial" w:hAnsi="Arial" w:cs="Arial"/>
-          <w:sz w:val="24"/>
-          <w:lang w:val="es-CO"/>
-        </w:rPr>
-      </w:pPr>
-      <w:r>
-        <w:rPr>
-          <w:rFonts w:ascii="Arial" w:hAnsi="Arial" w:cs="Arial"/>
-          <w:sz w:val="24"/>
-          <w:lang w:val="es-CO"/>
-        </w:rPr>
-        <w:t>Llamado de los métodos de las clases Factory en el controlador para la creación de usuarios:</w:t>
-      </w:r>
-    </w:p>
-    <w:p>
-      <w:pPr>
-        <w:jc w:val="both"/>
-        <w:rPr>
-          <w:rFonts w:ascii="Arial" w:hAnsi="Arial" w:cs="Arial"/>
-          <w:sz w:val="24"/>
-          <w:lang w:val="es-CO"/>
-        </w:rPr>
-      </w:pPr>
-      <w:r>
-        <w:rPr>
-          <w:rFonts w:ascii="Arial" w:hAnsi="Arial" w:cs="Arial"/>
-          <w:sz w:val="24"/>
-          <w:lang w:val="es-CO"/>
-        </w:rPr>
+        <w:t>Rol rol) que devuelve la instancia adecuada.</w:t>
+      </w:r>
+    </w:p>
+    <w:p>
+      <w:pPr>
+        <w:jc w:val="both"/>
+        <w:rPr>
+          <w:rFonts w:ascii="Arial" w:hAnsi="Arial" w:cs="Arial"/>
+          <w:sz w:val="24"/>
+          <w:lang w:val="es-CO"/>
+        </w:rPr>
+      </w:pPr>
+      <w:r>
+        <w:rPr>
+          <w:rFonts w:ascii="Arial" w:hAnsi="Arial" w:cs="Arial"/>
+          <w:noProof/>
+          <w:sz w:val="24"/>
+          <w:lang w:eastAsia="es-ES"/>
+        </w:rPr>
+        <w:lastRenderedPageBreak/>
         <w:drawing>
-          <wp:inline distT="0" distB="0" distL="0" distR="0" wp14:anchorId="5438E839" wp14:editId="7F862D43">
-            <wp:extent cx="5400040" cy="3295650"/>
-            <wp:effectExtent l="0" t="0" r="0" b="0"/>
-            <wp:docPr id="9" name="Picture 9"/>
+          <wp:inline distT="0" distB="0" distL="0" distR="0" wp14:anchorId="2B1F6413" wp14:editId="65BE7884">
+            <wp:extent cx="5400040" cy="2129155"/>
+            <wp:effectExtent l="0" t="0" r="0" b="4445"/>
+            <wp:docPr id="8" name="Picture 8"/>
             <wp:cNvGraphicFramePr>
               <a:graphicFrameLocks xmlns:a="http://schemas.openxmlformats.org/drawingml/2006/main" noChangeAspect="1"/>
             </wp:cNvGraphicFramePr>
@@ -2164,7 +2108,7 @@
                   <pic:spPr>
                     <a:xfrm>
                       <a:off x="0" y="0"/>
-                      <a:ext cx="5400040" cy="3295650"/>
+                      <a:ext cx="5400040" cy="2129155"/>
                     </a:xfrm>
                     <a:prstGeom prst="rect">
                       <a:avLst/>
@@ -2186,85 +2130,216 @@
           <w:lang w:val="es-CO"/>
         </w:rPr>
       </w:pPr>
-    </w:p>
-    <w:p>
-      <w:pPr>
-        <w:jc w:val="both"/>
-        <w:rPr>
-          <w:rFonts w:ascii="Arial" w:hAnsi="Arial" w:cs="Arial"/>
-          <w:sz w:val="24"/>
-          <w:lang w:val="es-CO"/>
-        </w:rPr>
-      </w:pPr>
-    </w:p>
-    <w:p>
-      <w:pPr>
-        <w:jc w:val="both"/>
-        <w:rPr>
-          <w:rFonts w:ascii="Arial" w:hAnsi="Arial" w:cs="Arial"/>
-          <w:sz w:val="24"/>
-          <w:lang w:val="es-CO"/>
-        </w:rPr>
-      </w:pPr>
-    </w:p>
-    <w:p>
-      <w:pPr>
-        <w:jc w:val="both"/>
-        <w:rPr>
-          <w:rFonts w:ascii="Arial" w:hAnsi="Arial" w:cs="Arial"/>
-          <w:sz w:val="24"/>
-          <w:lang w:val="es-CO"/>
-        </w:rPr>
-      </w:pPr>
-    </w:p>
-    <w:p>
-      <w:pPr>
-        <w:jc w:val="both"/>
-        <w:rPr>
-          <w:rFonts w:ascii="Arial" w:hAnsi="Arial" w:cs="Arial"/>
-          <w:sz w:val="24"/>
-          <w:lang w:val="es-CO"/>
-        </w:rPr>
-      </w:pPr>
-    </w:p>
-    <w:p>
-      <w:pPr>
-        <w:jc w:val="both"/>
-        <w:rPr>
-          <w:rFonts w:ascii="Arial" w:hAnsi="Arial" w:cs="Arial"/>
-          <w:sz w:val="24"/>
-          <w:lang w:val="es-CO"/>
-        </w:rPr>
-      </w:pPr>
-      <w:r>
-        <w:rPr>
-          <w:rFonts w:ascii="Arial" w:hAnsi="Arial" w:cs="Arial"/>
-          <w:sz w:val="24"/>
-          <w:lang w:val="es-CO"/>
-        </w:rPr>
-        <w:lastRenderedPageBreak/>
-        <w:t>Formulario para crear usuarios:</w:t>
-      </w:r>
-    </w:p>
-    <w:p>
-      <w:pPr>
-        <w:jc w:val="both"/>
-        <w:rPr>
-          <w:rFonts w:ascii="Arial" w:hAnsi="Arial" w:cs="Arial"/>
-          <w:sz w:val="24"/>
-          <w:lang w:val="es-CO"/>
-        </w:rPr>
-      </w:pPr>
-      <w:r>
-        <w:rPr>
+      <w:r>
+        <w:rPr>
+          <w:rFonts w:ascii="Arial" w:hAnsi="Arial" w:cs="Arial"/>
+          <w:sz w:val="24"/>
+          <w:lang w:val="es-CO"/>
+        </w:rPr>
+        <w:t xml:space="preserve">El flujo de ejecución queda así: el controlador recibe la solicitud de creación de usuario junto con el rol elegido, invoca </w:t>
+      </w:r>
+      <w:proofErr w:type="spellStart"/>
+      <w:r>
+        <w:rPr>
+          <w:rFonts w:ascii="Arial" w:hAnsi="Arial" w:cs="Arial"/>
+          <w:sz w:val="24"/>
+          <w:lang w:val="es-CO"/>
+        </w:rPr>
+        <w:t>usuarioFactoryProvider.getFactory</w:t>
+      </w:r>
+      <w:proofErr w:type="spellEnd"/>
+      <w:r>
+        <w:rPr>
+          <w:rFonts w:ascii="Arial" w:hAnsi="Arial" w:cs="Arial"/>
+          <w:sz w:val="24"/>
+          <w:lang w:val="es-CO"/>
+        </w:rPr>
+        <w:t xml:space="preserve">(rol) para obtener la </w:t>
+      </w:r>
+      <w:proofErr w:type="spellStart"/>
+      <w:r>
+        <w:rPr>
+          <w:rFonts w:ascii="Arial" w:hAnsi="Arial" w:cs="Arial"/>
+          <w:sz w:val="24"/>
+          <w:lang w:val="es-CO"/>
+        </w:rPr>
+        <w:t>factory</w:t>
+      </w:r>
+      <w:proofErr w:type="spellEnd"/>
+      <w:r>
+        <w:rPr>
+          <w:rFonts w:ascii="Arial" w:hAnsi="Arial" w:cs="Arial"/>
+          <w:sz w:val="24"/>
+          <w:lang w:val="es-CO"/>
+        </w:rPr>
+        <w:t xml:space="preserve"> correspondiente, y sobre esa </w:t>
+      </w:r>
+      <w:proofErr w:type="spellStart"/>
+      <w:r>
+        <w:rPr>
+          <w:rFonts w:ascii="Arial" w:hAnsi="Arial" w:cs="Arial"/>
+          <w:sz w:val="24"/>
+          <w:lang w:val="es-CO"/>
+        </w:rPr>
+        <w:t>fact</w:t>
+      </w:r>
+      <w:r>
+        <w:rPr>
+          <w:rFonts w:ascii="Arial" w:hAnsi="Arial" w:cs="Arial"/>
+          <w:sz w:val="24"/>
+          <w:lang w:val="es-CO"/>
+        </w:rPr>
+        <w:t>ory</w:t>
+      </w:r>
+      <w:proofErr w:type="spellEnd"/>
+      <w:r>
+        <w:rPr>
+          <w:rFonts w:ascii="Arial" w:hAnsi="Arial" w:cs="Arial"/>
+          <w:sz w:val="24"/>
+          <w:lang w:val="es-CO"/>
+        </w:rPr>
+        <w:t xml:space="preserve"> llama a </w:t>
+      </w:r>
+      <w:proofErr w:type="spellStart"/>
+      <w:proofErr w:type="gramStart"/>
+      <w:r>
+        <w:rPr>
+          <w:rFonts w:ascii="Arial" w:hAnsi="Arial" w:cs="Arial"/>
+          <w:sz w:val="24"/>
+          <w:lang w:val="es-CO"/>
+        </w:rPr>
+        <w:t>registrarUsuario</w:t>
+      </w:r>
+      <w:proofErr w:type="spellEnd"/>
+      <w:r>
+        <w:rPr>
+          <w:rFonts w:ascii="Arial" w:hAnsi="Arial" w:cs="Arial"/>
+          <w:sz w:val="24"/>
+          <w:lang w:val="es-CO"/>
+        </w:rPr>
+        <w:t>(</w:t>
+      </w:r>
+      <w:proofErr w:type="gramEnd"/>
+      <w:r>
+        <w:rPr>
+          <w:rFonts w:ascii="Arial" w:hAnsi="Arial" w:cs="Arial"/>
+          <w:sz w:val="24"/>
+          <w:lang w:val="es-CO"/>
+        </w:rPr>
+        <w:t xml:space="preserve">). Este método ejecuta internamente el </w:t>
+      </w:r>
+      <w:proofErr w:type="spellStart"/>
+      <w:r>
+        <w:rPr>
+          <w:rFonts w:ascii="Arial" w:hAnsi="Arial" w:cs="Arial"/>
+          <w:sz w:val="24"/>
+          <w:lang w:val="es-CO"/>
+        </w:rPr>
+        <w:t>factory</w:t>
+      </w:r>
+      <w:proofErr w:type="spellEnd"/>
+      <w:r>
+        <w:rPr>
+          <w:rFonts w:ascii="Arial" w:hAnsi="Arial" w:cs="Arial"/>
+          <w:sz w:val="24"/>
+          <w:lang w:val="es-CO"/>
+        </w:rPr>
+        <w:t xml:space="preserve"> </w:t>
+      </w:r>
+      <w:proofErr w:type="spellStart"/>
+      <w:r>
+        <w:rPr>
+          <w:rFonts w:ascii="Arial" w:hAnsi="Arial" w:cs="Arial"/>
+          <w:sz w:val="24"/>
+          <w:lang w:val="es-CO"/>
+        </w:rPr>
+        <w:t>m</w:t>
+      </w:r>
+      <w:r>
+        <w:rPr>
+          <w:rFonts w:ascii="Arial" w:hAnsi="Arial" w:cs="Arial"/>
+          <w:sz w:val="24"/>
+          <w:lang w:val="es-CO"/>
+        </w:rPr>
+        <w:t>ethod</w:t>
+      </w:r>
+      <w:proofErr w:type="spellEnd"/>
+      <w:r>
+        <w:rPr>
+          <w:rFonts w:ascii="Arial" w:hAnsi="Arial" w:cs="Arial"/>
+          <w:sz w:val="24"/>
+          <w:lang w:val="es-CO"/>
+        </w:rPr>
+        <w:t xml:space="preserve"> </w:t>
+      </w:r>
+      <w:proofErr w:type="spellStart"/>
+      <w:proofErr w:type="gramStart"/>
+      <w:r>
+        <w:rPr>
+          <w:rFonts w:ascii="Arial" w:hAnsi="Arial" w:cs="Arial"/>
+          <w:sz w:val="24"/>
+          <w:lang w:val="es-CO"/>
+        </w:rPr>
+        <w:t>crearUsuarioEspecifico</w:t>
+      </w:r>
+      <w:proofErr w:type="spellEnd"/>
+      <w:r>
+        <w:rPr>
+          <w:rFonts w:ascii="Arial" w:hAnsi="Arial" w:cs="Arial"/>
+          <w:sz w:val="24"/>
+          <w:lang w:val="es-CO"/>
+        </w:rPr>
+        <w:t>(</w:t>
+      </w:r>
+      <w:proofErr w:type="gramEnd"/>
+      <w:r>
+        <w:rPr>
+          <w:rFonts w:ascii="Arial" w:hAnsi="Arial" w:cs="Arial"/>
+          <w:sz w:val="24"/>
+          <w:lang w:val="es-CO"/>
+        </w:rPr>
+        <w:t>), que retorna la instancia concreta de Usuario ya construida, la cual el controlador guarda en el repositorio.</w:t>
+      </w:r>
+    </w:p>
+    <w:p>
+      <w:pPr>
+        <w:jc w:val="both"/>
+        <w:rPr>
+          <w:rFonts w:ascii="Arial" w:hAnsi="Arial" w:cs="Arial"/>
+          <w:sz w:val="24"/>
+          <w:lang w:val="es-CO"/>
+        </w:rPr>
+      </w:pPr>
+      <w:r>
+        <w:rPr>
+          <w:rFonts w:ascii="Arial" w:hAnsi="Arial" w:cs="Arial"/>
+          <w:sz w:val="24"/>
+          <w:lang w:val="es-CO"/>
+        </w:rPr>
+        <w:t>Llamado de los métodos de las clases Factory en el controlador para la creación de usuarios:</w:t>
+      </w:r>
+    </w:p>
+    <w:p>
+      <w:pPr>
+        <w:jc w:val="both"/>
+        <w:rPr>
+          <w:rFonts w:ascii="Arial" w:hAnsi="Arial" w:cs="Arial"/>
+          <w:sz w:val="24"/>
+          <w:lang w:val="es-CO"/>
+        </w:rPr>
+      </w:pPr>
+      <w:r>
+        <w:rPr>
+          <w:rFonts w:ascii="Arial" w:hAnsi="Arial" w:cs="Arial"/>
           <w:noProof/>
+          <w:sz w:val="24"/>
           <w:lang w:eastAsia="es-ES"/>
         </w:rPr>
         <w:drawing>
-          <wp:inline distT="0" distB="0" distL="0" distR="0" wp14:anchorId="0F49F7DD" wp14:editId="46EED365">
-            <wp:extent cx="5400040" cy="3037840"/>
+          <wp:inline distT="0" distB="0" distL="0" distR="0" wp14:anchorId="5438E839" wp14:editId="7F862D43">
+            <wp:extent cx="5400040" cy="3295650"/>
             <wp:effectExtent l="0" t="0" r="0" b="0"/>
-            <wp:docPr id="10" name="Picture 10"/>
+            <wp:docPr id="9" name="Picture 9"/>
             <wp:cNvGraphicFramePr>
               <a:graphicFrameLocks xmlns:a="http://schemas.openxmlformats.org/drawingml/2006/main" noChangeAspect="1"/>
             </wp:cNvGraphicFramePr>
@@ -2284,7 +2359,7 @@
                   <pic:spPr>
                     <a:xfrm>
                       <a:off x="0" y="0"/>
-                      <a:ext cx="5400040" cy="3037840"/>
+                      <a:ext cx="5400040" cy="3295650"/>
                     </a:xfrm>
                     <a:prstGeom prst="rect">
                       <a:avLst/>
@@ -2306,16 +2381,85 @@
           <w:lang w:val="es-CO"/>
         </w:rPr>
       </w:pPr>
+    </w:p>
+    <w:p>
+      <w:pPr>
+        <w:jc w:val="both"/>
+        <w:rPr>
+          <w:rFonts w:ascii="Arial" w:hAnsi="Arial" w:cs="Arial"/>
+          <w:sz w:val="24"/>
+          <w:lang w:val="es-CO"/>
+        </w:rPr>
+      </w:pPr>
+    </w:p>
+    <w:p>
+      <w:pPr>
+        <w:jc w:val="both"/>
+        <w:rPr>
+          <w:rFonts w:ascii="Arial" w:hAnsi="Arial" w:cs="Arial"/>
+          <w:sz w:val="24"/>
+          <w:lang w:val="es-CO"/>
+        </w:rPr>
+      </w:pPr>
+    </w:p>
+    <w:p>
+      <w:pPr>
+        <w:jc w:val="both"/>
+        <w:rPr>
+          <w:rFonts w:ascii="Arial" w:hAnsi="Arial" w:cs="Arial"/>
+          <w:sz w:val="24"/>
+          <w:lang w:val="es-CO"/>
+        </w:rPr>
+      </w:pPr>
+    </w:p>
+    <w:p>
+      <w:pPr>
+        <w:jc w:val="both"/>
+        <w:rPr>
+          <w:rFonts w:ascii="Arial" w:hAnsi="Arial" w:cs="Arial"/>
+          <w:sz w:val="24"/>
+          <w:lang w:val="es-CO"/>
+        </w:rPr>
+      </w:pPr>
+    </w:p>
+    <w:p>
+      <w:pPr>
+        <w:jc w:val="both"/>
+        <w:rPr>
+          <w:rFonts w:ascii="Arial" w:hAnsi="Arial" w:cs="Arial"/>
+          <w:sz w:val="24"/>
+          <w:lang w:val="es-CO"/>
+        </w:rPr>
+      </w:pPr>
+      <w:r>
+        <w:rPr>
+          <w:rFonts w:ascii="Arial" w:hAnsi="Arial" w:cs="Arial"/>
+          <w:sz w:val="24"/>
+          <w:lang w:val="es-CO"/>
+        </w:rPr>
+        <w:lastRenderedPageBreak/>
+        <w:t>Formulario para crear usuarios:</w:t>
+      </w:r>
+    </w:p>
+    <w:p>
+      <w:pPr>
+        <w:jc w:val="both"/>
+        <w:rPr>
+          <w:rFonts w:ascii="Arial" w:hAnsi="Arial" w:cs="Arial"/>
+          <w:sz w:val="24"/>
+          <w:lang w:val="es-CO"/>
+        </w:rPr>
+      </w:pPr>
       <w:r>
         <w:rPr>
           <w:noProof/>
           <w:lang w:eastAsia="es-ES"/>
         </w:rPr>
         <w:drawing>
-          <wp:inline distT="0" distB="0" distL="0" distR="0" wp14:anchorId="014BDB70" wp14:editId="525ECA9A">
+          <wp:inline distT="0" distB="0" distL="0" distR="0" wp14:anchorId="0F49F7DD" wp14:editId="46EED365">
             <wp:extent cx="5400040" cy="3037840"/>
             <wp:effectExtent l="0" t="0" r="0" b="0"/>
-            <wp:docPr id="11" name="Picture 11"/>
+            <wp:docPr id="10" name="Picture 10"/>
             <wp:cNvGraphicFramePr>
               <a:graphicFrameLocks xmlns:a="http://schemas.openxmlformats.org/drawingml/2006/main" noChangeAspect="1"/>
             </wp:cNvGraphicFramePr>
@@ -2357,6 +2501,57 @@
           <w:lang w:val="es-CO"/>
         </w:rPr>
       </w:pPr>
+      <w:r>
+        <w:rPr>
+          <w:noProof/>
+          <w:lang w:eastAsia="es-ES"/>
+        </w:rPr>
+        <w:drawing>
+          <wp:inline distT="0" distB="0" distL="0" distR="0" wp14:anchorId="014BDB70" wp14:editId="525ECA9A">
+            <wp:extent cx="5400040" cy="3037840"/>
+            <wp:effectExtent l="0" t="0" r="0" b="0"/>
+            <wp:docPr id="11" name="Picture 11"/>
+            <wp:cNvGraphicFramePr>
+              <a:graphicFrameLocks xmlns:a="http://schemas.openxmlformats.org/drawingml/2006/main" noChangeAspect="1"/>
+            </wp:cNvGraphicFramePr>
+            <a:graphic xmlns:a="http://schemas.openxmlformats.org/drawingml/2006/main">
+              <a:graphicData uri="http://schemas.openxmlformats.org/drawingml/2006/picture">
+                <pic:pic xmlns:pic="http://schemas.openxmlformats.org/drawingml/2006/picture">
+                  <pic:nvPicPr>
+                    <pic:cNvPr id="1" name=""/>
+                    <pic:cNvPicPr/>
+                  </pic:nvPicPr>
+                  <pic:blipFill>
+                    <a:blip r:embed="rId16"/>
+                    <a:stretch>
+                      <a:fillRect/>
+                    </a:stretch>
+                  </pic:blipFill>
+                  <pic:spPr>
+                    <a:xfrm>
+                      <a:off x="0" y="0"/>
+                      <a:ext cx="5400040" cy="3037840"/>
+                    </a:xfrm>
+                    <a:prstGeom prst="rect">
+                      <a:avLst/>
+                    </a:prstGeom>
+                  </pic:spPr>
+                </pic:pic>
+              </a:graphicData>
+            </a:graphic>
+          </wp:inline>
+        </w:drawing>
+      </w:r>
+    </w:p>
+    <w:p>
+      <w:pPr>
+        <w:jc w:val="both"/>
+        <w:rPr>
+          <w:rFonts w:ascii="Arial" w:hAnsi="Arial" w:cs="Arial"/>
+          <w:sz w:val="24"/>
+          <w:lang w:val="es-CO"/>
+        </w:rPr>
+      </w:pPr>
     </w:p>
     <w:p>
       <w:pPr>
@@ -2479,7 +2674,7 @@
                     <pic:cNvPicPr/>
                   </pic:nvPicPr>
                   <pic:blipFill>
-                    <a:blip r:embed="rId16"/>
+                    <a:blip r:embed="rId17"/>
                     <a:stretch>
                       <a:fillRect/>
                     </a:stretch>

</xml_diff>